<commit_message>
Another small update to doc.
</commit_message>
<xml_diff>
--- a/TakeHomeTest.docx
+++ b/TakeHomeTest.docx
@@ -1319,8 +1319,6 @@
     <w:p>
       <w:pPr>
         <w:pStyle w:val="Normal"/>
-        <w:bidi w:val="0"/>
-        <w:jc w:val="left"/>
         <w:rPr/>
       </w:pPr>
       <w:r>
@@ -1547,6 +1545,81 @@
               <w:rPr/>
               <w:t>Created a custom insightface/recognition/faceswap package based on the other insightface/recognition packages, like arcface_torch.  Too big to add here.</w:t>
             </w:r>
+          </w:p>
+        </w:tc>
+      </w:tr>
+      <w:tr>
+        <w:trPr>
+          <w:trHeight w:val="701" w:hRule="atLeast"/>
+        </w:trPr>
+        <w:tc>
+          <w:tcPr>
+            <w:tcW w:w="2048" w:type="dxa"/>
+            <w:tcBorders/>
+            <w:vAlign w:val="bottom"/>
+          </w:tcPr>
+          <w:p>
+            <w:pPr>
+              <w:pStyle w:val="Normal"/>
+              <w:tabs>
+                <w:tab w:val="clear" w:pos="720"/>
+              </w:tabs>
+              <w:jc w:val="left"/>
+              <w:rPr/>
+            </w:pPr>
+            <w:r>
+              <w:rPr/>
+            </w:r>
+          </w:p>
+        </w:tc>
+        <w:tc>
+          <w:tcPr>
+            <w:tcW w:w="4505" w:type="dxa"/>
+            <w:tcBorders/>
+            <w:vAlign w:val="bottom"/>
+          </w:tcPr>
+          <w:p>
+            <w:pPr>
+              <w:pStyle w:val="Normal"/>
+              <w:tabs>
+                <w:tab w:val="clear" w:pos="720"/>
+              </w:tabs>
+              <w:jc w:val="left"/>
+              <w:rPr/>
+            </w:pPr>
+            <w:r>
+              <w:rPr/>
+            </w:r>
+          </w:p>
+        </w:tc>
+        <w:tc>
+          <w:tcPr>
+            <w:tcW w:w="4564" w:type="dxa"/>
+            <w:tcBorders/>
+            <w:vAlign w:val="bottom"/>
+          </w:tcPr>
+          <w:p>
+            <w:pPr>
+              <w:pStyle w:val="Normal"/>
+              <w:tabs>
+                <w:tab w:val="clear" w:pos="720"/>
+              </w:tabs>
+              <w:jc w:val="left"/>
+              <w:rPr/>
+            </w:pPr>
+            <w:r>
+              <w:rPr/>
+              <w:t>new faceswap package is similar to arcface_torch:</w:t>
+              <w:br/>
+            </w:r>
+            <w:hyperlink r:id="rId3">
+              <w:r>
+                <w:rPr>
+                  <w:rStyle w:val="InternetLink"/>
+                </w:rPr>
+                <w:t>https://github.com/deepinsight/insightface/tree/master/recognition/arcface_torch</w:t>
+              </w:r>
+            </w:hyperlink>
           </w:p>
         </w:tc>
       </w:tr>
@@ -1882,6 +1955,7 @@
       <w:rPr>
         <w:rFonts w:ascii="Liberation Serif" w:hAnsi="Liberation Serif" w:eastAsia="Noto Serif CJK SC" w:cs="Lohit Devanagari"/>
         <w:kern w:val="2"/>
+        <w:sz w:val="20"/>
         <w:szCs w:val="24"/>
         <w:lang w:val="en-US" w:eastAsia="zh-CN" w:bidi="hi-IN"/>
       </w:rPr>

</xml_diff>